<commit_message>
Mise a jour des 4 documents de conception : JWT, role administrateur, UUID, 404 pour les tirelires d'autrui, pagination et filtres, progression
</commit_message>
<xml_diff>
--- a/Cahier des charges vc.docx
+++ b/Cahier des charges vc.docx
@@ -130,8 +130,8 @@
         <w:spacing w:before="400" w:after="200" w:line="360" w:lineRule="auto"/>
       </w:pPr>
       <w:bookmarkStart w:id="0" w:name="_Toc238413432"/>
-      <w:bookmarkStart w:id="1" w:name="_Toc238986022"/>
-      <w:bookmarkStart w:id="2" w:name="_Toc238986072"/>
+      <w:bookmarkStart w:id="1" w:name="_Toc238986072"/>
+      <w:bookmarkStart w:id="2" w:name="_Toc243773194"/>
       <w:r>
         <w:rPr>
           <w:rFonts w:eastAsia="Calibri"/>
@@ -182,7 +182,28 @@
         </w:rPr>
         <w:fldChar w:fldCharType="separate"/>
       </w:r>
-      <w:hyperlink w:anchor="_Toc238986072" w:history="1">
+      <w:r>
+        <w:rPr>
+          <w:sz w:val="24"/>
+          <w:szCs w:val="24"/>
+        </w:rPr>
+        <w:fldChar w:fldCharType="begin"/>
+      </w:r>
+      <w:r>
+        <w:rPr>
+          <w:sz w:val="24"/>
+          <w:szCs w:val="24"/>
+        </w:rPr>
+        <w:instrText xml:space="preserve"> TOC \o "1-3" \h \z \u </w:instrText>
+      </w:r>
+      <w:r>
+        <w:rPr>
+          <w:sz w:val="24"/>
+          <w:szCs w:val="24"/>
+        </w:rPr>
+        <w:fldChar w:fldCharType="separate"/>
+      </w:r>
+      <w:hyperlink w:anchor="_Toc243773194" w:history="1">
         <w:r>
           <w:rPr>
             <w:rStyle w:val="Lienhypertexte"/>
@@ -220,7 +241,7 @@
             <w:sz w:val="24"/>
             <w:szCs w:val="24"/>
           </w:rPr>
-          <w:instrText xml:space="preserve"> PAGEREF _Toc238986072 \h </w:instrText>
+          <w:instrText xml:space="preserve"> PAGEREF _Toc243773194 \h </w:instrText>
         </w:r>
         <w:r>
           <w:rPr>
@@ -273,7 +294,7 @@
           <w:szCs w:val="24"/>
         </w:rPr>
       </w:pPr>
-      <w:hyperlink w:anchor="_Toc238986073" w:history="1">
+      <w:hyperlink w:anchor="_Toc243773195" w:history="1">
         <w:r>
           <w:rPr>
             <w:rStyle w:val="Lienhypertexte"/>
@@ -311,7 +332,7 @@
             <w:sz w:val="24"/>
             <w:szCs w:val="24"/>
           </w:rPr>
-          <w:instrText xml:space="preserve"> PAGEREF _Toc238986073 \h </w:instrText>
+          <w:instrText xml:space="preserve"> PAGEREF _Toc243773195 \h </w:instrText>
         </w:r>
         <w:r>
           <w:rPr>
@@ -364,7 +385,7 @@
           <w:szCs w:val="24"/>
         </w:rPr>
       </w:pPr>
-      <w:hyperlink w:anchor="_Toc238986074" w:history="1">
+      <w:hyperlink w:anchor="_Toc243773196" w:history="1">
         <w:r>
           <w:rPr>
             <w:rStyle w:val="Lienhypertexte"/>
@@ -402,7 +423,7 @@
             <w:sz w:val="24"/>
             <w:szCs w:val="24"/>
           </w:rPr>
-          <w:instrText xml:space="preserve"> PAGEREF _Toc238986074 \h </w:instrText>
+          <w:instrText xml:space="preserve"> PAGEREF _Toc243773196 \h </w:instrText>
         </w:r>
         <w:r>
           <w:rPr>
@@ -455,7 +476,7 @@
           <w:szCs w:val="24"/>
         </w:rPr>
       </w:pPr>
-      <w:hyperlink w:anchor="_Toc238986075" w:history="1">
+      <w:hyperlink w:anchor="_Toc243773197" w:history="1">
         <w:r>
           <w:rPr>
             <w:rStyle w:val="Lienhypertexte"/>
@@ -493,7 +514,7 @@
             <w:sz w:val="24"/>
             <w:szCs w:val="24"/>
           </w:rPr>
-          <w:instrText xml:space="preserve"> PAGEREF _Toc238986075 \h </w:instrText>
+          <w:instrText xml:space="preserve"> PAGEREF _Toc243773197 \h </w:instrText>
         </w:r>
         <w:r>
           <w:rPr>
@@ -546,7 +567,7 @@
           <w:szCs w:val="24"/>
         </w:rPr>
       </w:pPr>
-      <w:hyperlink w:anchor="_Toc238986076" w:history="1">
+      <w:hyperlink w:anchor="_Toc243773198" w:history="1">
         <w:r>
           <w:rPr>
             <w:rStyle w:val="Lienhypertexte"/>
@@ -584,7 +605,7 @@
             <w:sz w:val="24"/>
             <w:szCs w:val="24"/>
           </w:rPr>
-          <w:instrText xml:space="preserve"> PAGEREF _Toc238986076 \h </w:instrText>
+          <w:instrText xml:space="preserve"> PAGEREF _Toc243773198 \h </w:instrText>
         </w:r>
         <w:r>
           <w:rPr>
@@ -637,7 +658,7 @@
           <w:szCs w:val="24"/>
         </w:rPr>
       </w:pPr>
-      <w:hyperlink w:anchor="_Toc238986079" w:history="1">
+      <w:hyperlink w:anchor="_Toc243773201" w:history="1">
         <w:r>
           <w:rPr>
             <w:rStyle w:val="Lienhypertexte"/>
@@ -675,7 +696,7 @@
             <w:sz w:val="24"/>
             <w:szCs w:val="24"/>
           </w:rPr>
-          <w:instrText xml:space="preserve"> PAGEREF _Toc238986079 \h </w:instrText>
+          <w:instrText xml:space="preserve"> PAGEREF _Toc243773201 \h </w:instrText>
         </w:r>
         <w:r>
           <w:rPr>
@@ -728,7 +749,7 @@
           <w:szCs w:val="24"/>
         </w:rPr>
       </w:pPr>
-      <w:hyperlink w:anchor="_Toc238986082" w:history="1">
+      <w:hyperlink w:anchor="_Toc243773204" w:history="1">
         <w:r>
           <w:rPr>
             <w:rStyle w:val="Lienhypertexte"/>
@@ -765,7 +786,7 @@
             <w:sz w:val="24"/>
             <w:szCs w:val="24"/>
           </w:rPr>
-          <w:instrText xml:space="preserve"> PAGEREF _Toc238986082 \h </w:instrText>
+          <w:instrText xml:space="preserve"> PAGEREF _Toc243773204 \h </w:instrText>
         </w:r>
         <w:r>
           <w:rPr>
@@ -818,7 +839,7 @@
           <w:szCs w:val="24"/>
         </w:rPr>
       </w:pPr>
-      <w:hyperlink w:anchor="_Toc238986085" w:history="1">
+      <w:hyperlink w:anchor="_Toc243773207" w:history="1">
         <w:r>
           <w:rPr>
             <w:rStyle w:val="Lienhypertexte"/>
@@ -855,7 +876,7 @@
             <w:sz w:val="24"/>
             <w:szCs w:val="24"/>
           </w:rPr>
-          <w:instrText xml:space="preserve"> PAGEREF _Toc238986085 \h </w:instrText>
+          <w:instrText xml:space="preserve"> PAGEREF _Toc243773207 \h </w:instrText>
         </w:r>
         <w:r>
           <w:rPr>
@@ -908,7 +929,7 @@
           <w:szCs w:val="24"/>
         </w:rPr>
       </w:pPr>
-      <w:hyperlink w:anchor="_Toc238986090" w:history="1">
+      <w:hyperlink w:anchor="_Toc243773212" w:history="1">
         <w:r>
           <w:rPr>
             <w:rStyle w:val="Lienhypertexte"/>
@@ -946,7 +967,7 @@
             <w:sz w:val="24"/>
             <w:szCs w:val="24"/>
           </w:rPr>
-          <w:instrText xml:space="preserve"> PAGEREF _Toc238986090 \h </w:instrText>
+          <w:instrText xml:space="preserve"> PAGEREF _Toc243773212 \h </w:instrText>
         </w:r>
         <w:r>
           <w:rPr>
@@ -999,7 +1020,7 @@
           <w:szCs w:val="24"/>
         </w:rPr>
       </w:pPr>
-      <w:hyperlink w:anchor="_Toc238986091" w:history="1">
+      <w:hyperlink w:anchor="_Toc243773213" w:history="1">
         <w:r>
           <w:rPr>
             <w:rStyle w:val="Lienhypertexte"/>
@@ -1037,7 +1058,7 @@
             <w:sz w:val="24"/>
             <w:szCs w:val="24"/>
           </w:rPr>
-          <w:instrText xml:space="preserve"> PAGEREF _Toc238986091 \h </w:instrText>
+          <w:instrText xml:space="preserve"> PAGEREF _Toc243773213 \h </w:instrText>
         </w:r>
         <w:r>
           <w:rPr>
@@ -1090,7 +1111,7 @@
           <w:szCs w:val="24"/>
         </w:rPr>
       </w:pPr>
-      <w:hyperlink w:anchor="_Toc238986092" w:history="1">
+      <w:hyperlink w:anchor="_Toc243773214" w:history="1">
         <w:r>
           <w:rPr>
             <w:rStyle w:val="Lienhypertexte"/>
@@ -1128,7 +1149,7 @@
             <w:sz w:val="24"/>
             <w:szCs w:val="24"/>
           </w:rPr>
-          <w:instrText xml:space="preserve"> PAGEREF _Toc238986092 \h </w:instrText>
+          <w:instrText xml:space="preserve"> PAGEREF _Toc243773214 \h </w:instrText>
         </w:r>
         <w:r>
           <w:rPr>
@@ -1154,7 +1175,7 @@
             <w:sz w:val="24"/>
             <w:szCs w:val="24"/>
           </w:rPr>
-          <w:t>7</w:t>
+          <w:t>8</w:t>
         </w:r>
         <w:r>
           <w:rPr>
@@ -1181,7 +1202,7 @@
           <w:szCs w:val="24"/>
         </w:rPr>
       </w:pPr>
-      <w:hyperlink w:anchor="_Toc238986093" w:history="1">
+      <w:hyperlink w:anchor="_Toc243773215" w:history="1">
         <w:r>
           <w:rPr>
             <w:rStyle w:val="Lienhypertexte"/>
@@ -1219,7 +1240,7 @@
             <w:sz w:val="24"/>
             <w:szCs w:val="24"/>
           </w:rPr>
-          <w:instrText xml:space="preserve"> PAGEREF _Toc238986093 \h </w:instrText>
+          <w:instrText xml:space="preserve"> PAGEREF _Toc243773215 \h </w:instrText>
         </w:r>
         <w:r>
           <w:rPr>
@@ -1245,7 +1266,7 @@
             <w:sz w:val="24"/>
             <w:szCs w:val="24"/>
           </w:rPr>
-          <w:t>8</w:t>
+          <w:t>9</w:t>
         </w:r>
         <w:r>
           <w:rPr>
@@ -1257,6 +1278,40 @@
           <w:fldChar w:fldCharType="end"/>
         </w:r>
       </w:hyperlink>
+    </w:p>
+    <w:p>
+      <w:pPr>
+        <w:tabs>
+          <w:tab w:val="left" w:pos="1248"/>
+        </w:tabs>
+        <w:spacing w:line="360" w:lineRule="auto"/>
+        <w:rPr>
+          <w:sz w:val="24"/>
+          <w:szCs w:val="24"/>
+        </w:rPr>
+      </w:pPr>
+      <w:r>
+        <w:rPr>
+          <w:sz w:val="24"/>
+          <w:szCs w:val="24"/>
+        </w:rPr>
+        <w:fldChar w:fldCharType="end"/>
+      </w:r>
+    </w:p>
+    <w:p>
+      <w:pPr>
+        <w:pStyle w:val="TM1"/>
+        <w:tabs>
+          <w:tab w:val="right" w:leader="dot" w:pos="9628"/>
+        </w:tabs>
+        <w:spacing w:line="360" w:lineRule="auto"/>
+        <w:rPr>
+          <w:rFonts w:asciiTheme="minorHAnsi" w:eastAsiaTheme="minorEastAsia" w:hAnsiTheme="minorHAnsi" w:cstheme="minorBidi"/>
+          <w:noProof/>
+          <w:sz w:val="24"/>
+          <w:szCs w:val="24"/>
+        </w:rPr>
+      </w:pPr>
     </w:p>
     <w:p>
       <w:pPr>
@@ -1296,8 +1351,8 @@
         </w:rPr>
       </w:pPr>
       <w:bookmarkStart w:id="3" w:name="_Toc238413433"/>
-      <w:bookmarkStart w:id="4" w:name="_Toc238986023"/>
-      <w:bookmarkStart w:id="5" w:name="_Toc238986073"/>
+      <w:bookmarkStart w:id="4" w:name="_Toc238986073"/>
+      <w:bookmarkStart w:id="5" w:name="_Toc243773195"/>
       <w:r>
         <w:rPr>
           <w:rFonts w:eastAsia="Calibri"/>
@@ -1678,6 +1733,186 @@
           </w:p>
         </w:tc>
       </w:tr>
+      <w:tr>
+        <w:tc>
+          <w:tcPr>
+            <w:tcW w:w="4814" w:type="dxa"/>
+          </w:tcPr>
+          <w:p>
+            <w:pPr>
+              <w:tabs>
+                <w:tab w:val="left" w:pos="1188"/>
+              </w:tabs>
+              <w:spacing w:line="360" w:lineRule="auto"/>
+              <w:rPr>
+                <w:sz w:val="24"/>
+                <w:szCs w:val="24"/>
+              </w:rPr>
+            </w:pPr>
+            <w:r>
+              <w:rPr>
+                <w:sz w:val="24"/>
+                <w:szCs w:val="24"/>
+              </w:rPr>
+              <w:t>JWT</w:t>
+            </w:r>
+          </w:p>
+        </w:tc>
+        <w:tc>
+          <w:tcPr>
+            <w:tcW w:w="4814" w:type="dxa"/>
+          </w:tcPr>
+          <w:p>
+            <w:pPr>
+              <w:spacing w:line="360" w:lineRule="auto"/>
+              <w:rPr>
+                <w:sz w:val="24"/>
+                <w:szCs w:val="24"/>
+              </w:rPr>
+            </w:pPr>
+            <w:r>
+              <w:rPr>
+                <w:sz w:val="24"/>
+                <w:szCs w:val="24"/>
+              </w:rPr>
+              <w:t>J</w:t>
+            </w:r>
+            <w:r>
+              <w:rPr>
+                <w:sz w:val="24"/>
+                <w:szCs w:val="24"/>
+              </w:rPr>
+              <w:t>eton signé contenant l’identité de l’utilisateur, à durée limitée</w:t>
+            </w:r>
+          </w:p>
+        </w:tc>
+      </w:tr>
+      <w:tr>
+        <w:tc>
+          <w:tcPr>
+            <w:tcW w:w="4814" w:type="dxa"/>
+          </w:tcPr>
+          <w:p>
+            <w:pPr>
+              <w:tabs>
+                <w:tab w:val="left" w:pos="1188"/>
+              </w:tabs>
+              <w:spacing w:line="360" w:lineRule="auto"/>
+              <w:rPr>
+                <w:sz w:val="24"/>
+                <w:szCs w:val="24"/>
+              </w:rPr>
+            </w:pPr>
+            <w:r>
+              <w:rPr>
+                <w:rStyle w:val="Accentuation"/>
+                <w:i w:val="0"/>
+                <w:iCs w:val="0"/>
+                <w:sz w:val="24"/>
+                <w:szCs w:val="24"/>
+              </w:rPr>
+              <w:t>Bearer</w:t>
+            </w:r>
+          </w:p>
+        </w:tc>
+        <w:tc>
+          <w:tcPr>
+            <w:tcW w:w="4814" w:type="dxa"/>
+          </w:tcPr>
+          <w:p>
+            <w:pPr>
+              <w:spacing w:line="360" w:lineRule="auto"/>
+              <w:rPr>
+                <w:sz w:val="24"/>
+                <w:szCs w:val="24"/>
+              </w:rPr>
+            </w:pPr>
+            <w:r>
+              <w:rPr>
+                <w:sz w:val="24"/>
+                <w:szCs w:val="24"/>
+              </w:rPr>
+              <w:t>P</w:t>
+            </w:r>
+            <w:r>
+              <w:rPr>
+                <w:sz w:val="24"/>
+                <w:szCs w:val="24"/>
+              </w:rPr>
+              <w:t xml:space="preserve">réfixe standard de l’en-tête </w:t>
+            </w:r>
+            <w:proofErr w:type="spellStart"/>
+            <w:r>
+              <w:rPr>
+                <w:rStyle w:val="CodeHTML"/>
+                <w:rFonts w:ascii="Times New Roman" w:hAnsi="Times New Roman" w:cs="Times New Roman"/>
+                <w:sz w:val="24"/>
+                <w:szCs w:val="24"/>
+              </w:rPr>
+              <w:t>Authorization</w:t>
+            </w:r>
+            <w:proofErr w:type="spellEnd"/>
+          </w:p>
+        </w:tc>
+      </w:tr>
+      <w:tr>
+        <w:tc>
+          <w:tcPr>
+            <w:tcW w:w="4814" w:type="dxa"/>
+          </w:tcPr>
+          <w:p>
+            <w:pPr>
+              <w:tabs>
+                <w:tab w:val="left" w:pos="1188"/>
+              </w:tabs>
+              <w:spacing w:line="360" w:lineRule="auto"/>
+              <w:rPr>
+                <w:rStyle w:val="Accentuation"/>
+                <w:sz w:val="24"/>
+                <w:szCs w:val="24"/>
+              </w:rPr>
+            </w:pPr>
+            <w:r>
+              <w:rPr>
+                <w:rStyle w:val="Accentuation"/>
+                <w:i w:val="0"/>
+                <w:iCs w:val="0"/>
+                <w:sz w:val="24"/>
+                <w:szCs w:val="24"/>
+              </w:rPr>
+              <w:t>UUID</w:t>
+            </w:r>
+          </w:p>
+        </w:tc>
+        <w:tc>
+          <w:tcPr>
+            <w:tcW w:w="4814" w:type="dxa"/>
+          </w:tcPr>
+          <w:p>
+            <w:pPr>
+              <w:spacing w:line="360" w:lineRule="auto"/>
+              <w:rPr>
+                <w:sz w:val="24"/>
+                <w:szCs w:val="24"/>
+              </w:rPr>
+            </w:pPr>
+            <w:r>
+              <w:rPr>
+                <w:sz w:val="24"/>
+                <w:szCs w:val="24"/>
+              </w:rPr>
+              <w:t>I</w:t>
+            </w:r>
+            <w:r>
+              <w:rPr>
+                <w:sz w:val="24"/>
+                <w:szCs w:val="24"/>
+              </w:rPr>
+              <w:t>dentifiant aléatoire non prédictible</w:t>
+            </w:r>
+          </w:p>
+        </w:tc>
+      </w:tr>
     </w:tbl>
     <w:p>
       <w:pPr>
@@ -1710,46 +1945,6 @@
       <w:pPr>
         <w:spacing w:line="360" w:lineRule="auto"/>
         <w:jc w:val="both"/>
-        <w:rPr>
-          <w:sz w:val="24"/>
-          <w:szCs w:val="24"/>
-        </w:rPr>
-      </w:pPr>
-    </w:p>
-    <w:p>
-      <w:pPr>
-        <w:spacing w:line="360" w:lineRule="auto"/>
-        <w:jc w:val="both"/>
-        <w:rPr>
-          <w:sz w:val="24"/>
-          <w:szCs w:val="24"/>
-        </w:rPr>
-      </w:pPr>
-    </w:p>
-    <w:p>
-      <w:pPr>
-        <w:spacing w:line="360" w:lineRule="auto"/>
-        <w:jc w:val="both"/>
-        <w:rPr>
-          <w:sz w:val="24"/>
-          <w:szCs w:val="24"/>
-        </w:rPr>
-      </w:pPr>
-    </w:p>
-    <w:p>
-      <w:pPr>
-        <w:spacing w:line="360" w:lineRule="auto"/>
-        <w:jc w:val="both"/>
-        <w:rPr>
-          <w:sz w:val="24"/>
-          <w:szCs w:val="24"/>
-        </w:rPr>
-      </w:pPr>
-    </w:p>
-    <w:p>
-      <w:pPr>
-        <w:spacing w:line="360" w:lineRule="auto"/>
-        <w:jc w:val="both"/>
       </w:pPr>
     </w:p>
     <w:p>
@@ -1759,8 +1954,8 @@
         <w:jc w:val="both"/>
       </w:pPr>
       <w:bookmarkStart w:id="6" w:name="_Toc238413434"/>
-      <w:bookmarkStart w:id="7" w:name="_Toc238986024"/>
-      <w:bookmarkStart w:id="8" w:name="_Toc238986074"/>
+      <w:bookmarkStart w:id="7" w:name="_Toc238986074"/>
+      <w:bookmarkStart w:id="8" w:name="_Toc243773196"/>
       <w:r>
         <w:rPr>
           <w:rFonts w:eastAsia="Calibri"/>
@@ -1836,8 +2031,8 @@
         <w:jc w:val="both"/>
       </w:pPr>
       <w:bookmarkStart w:id="9" w:name="_Toc238413435"/>
-      <w:bookmarkStart w:id="10" w:name="_Toc238986025"/>
-      <w:bookmarkStart w:id="11" w:name="_Toc238986075"/>
+      <w:bookmarkStart w:id="10" w:name="_Toc238986075"/>
+      <w:bookmarkStart w:id="11" w:name="_Toc243773197"/>
       <w:r>
         <w:rPr>
           <w:rFonts w:eastAsia="Calibri"/>
@@ -1967,8 +2162,8 @@
         <w:jc w:val="both"/>
       </w:pPr>
       <w:bookmarkStart w:id="12" w:name="_Toc238413436"/>
-      <w:bookmarkStart w:id="13" w:name="_Toc238986026"/>
-      <w:bookmarkStart w:id="14" w:name="_Toc238986076"/>
+      <w:bookmarkStart w:id="13" w:name="_Toc238986076"/>
+      <w:bookmarkStart w:id="14" w:name="_Toc243773198"/>
       <w:r>
         <w:rPr>
           <w:rFonts w:eastAsia="Calibri"/>
@@ -2007,8 +2202,8 @@
       <w:bookmarkStart w:id="15" w:name="_Toc238412447"/>
       <w:bookmarkStart w:id="16" w:name="_Toc238413364"/>
       <w:bookmarkStart w:id="17" w:name="_Toc238413437"/>
-      <w:bookmarkStart w:id="18" w:name="_Toc238986027"/>
-      <w:bookmarkStart w:id="19" w:name="_Toc238986077"/>
+      <w:bookmarkStart w:id="18" w:name="_Toc238986077"/>
+      <w:bookmarkStart w:id="19" w:name="_Toc243773199"/>
       <w:r>
         <w:rPr>
           <w:rFonts w:eastAsia="Calibri"/>
@@ -2125,8 +2320,8 @@
       <w:bookmarkStart w:id="20" w:name="_Toc238412448"/>
       <w:bookmarkStart w:id="21" w:name="_Toc238413365"/>
       <w:bookmarkStart w:id="22" w:name="_Toc238413438"/>
-      <w:bookmarkStart w:id="23" w:name="_Toc238986028"/>
-      <w:bookmarkStart w:id="24" w:name="_Toc238986078"/>
+      <w:bookmarkStart w:id="23" w:name="_Toc238986078"/>
+      <w:bookmarkStart w:id="24" w:name="_Toc243773200"/>
       <w:r>
         <w:rPr>
           <w:rFonts w:eastAsia="Calibri"/>
@@ -2271,8 +2466,8 @@
         <w:jc w:val="both"/>
       </w:pPr>
       <w:bookmarkStart w:id="25" w:name="_Toc238413439"/>
-      <w:bookmarkStart w:id="26" w:name="_Toc238986029"/>
-      <w:bookmarkStart w:id="27" w:name="_Toc238986079"/>
+      <w:bookmarkStart w:id="26" w:name="_Toc238986079"/>
+      <w:bookmarkStart w:id="27" w:name="_Toc243773201"/>
       <w:r>
         <w:rPr>
           <w:rFonts w:eastAsia="Calibri"/>
@@ -2348,8 +2543,8 @@
       <w:bookmarkStart w:id="28" w:name="_Toc238412450"/>
       <w:bookmarkStart w:id="29" w:name="_Toc238413367"/>
       <w:bookmarkStart w:id="30" w:name="_Toc238413440"/>
-      <w:bookmarkStart w:id="31" w:name="_Toc238986030"/>
-      <w:bookmarkStart w:id="32" w:name="_Toc238986080"/>
+      <w:bookmarkStart w:id="31" w:name="_Toc238986080"/>
+      <w:bookmarkStart w:id="32" w:name="_Toc243773202"/>
       <w:r>
         <w:rPr>
           <w:rFonts w:eastAsia="Calibri"/>
@@ -2495,21 +2690,7 @@
           <w:sz w:val="24"/>
           <w:szCs w:val="24"/>
         </w:rPr>
-        <w:t xml:space="preserve">Règles applicables </w:t>
-      </w:r>
-      <w:r>
-        <w:rPr>
-          <w:sz w:val="24"/>
-          <w:szCs w:val="24"/>
-        </w:rPr>
-        <w:t>à la création d’une tirelire</w:t>
-      </w:r>
-      <w:r>
-        <w:rPr>
-          <w:sz w:val="24"/>
-          <w:szCs w:val="24"/>
-        </w:rPr>
-        <w:t> :</w:t>
+        <w:t>Règles applicables à la création d’une tirelire :</w:t>
       </w:r>
     </w:p>
     <w:p>
@@ -2601,8 +2782,8 @@
       <w:bookmarkStart w:id="33" w:name="_Toc238412451"/>
       <w:bookmarkStart w:id="34" w:name="_Toc238413368"/>
       <w:bookmarkStart w:id="35" w:name="_Toc238413441"/>
-      <w:bookmarkStart w:id="36" w:name="_Toc238986031"/>
-      <w:bookmarkStart w:id="37" w:name="_Toc238986081"/>
+      <w:bookmarkStart w:id="36" w:name="_Toc238986081"/>
+      <w:bookmarkStart w:id="37" w:name="_Toc243773203"/>
       <w:r>
         <w:rPr>
           <w:rFonts w:eastAsia="Calibri"/>
@@ -2781,15 +2962,125 @@
     </w:p>
     <w:p>
       <w:pPr>
+        <w:pStyle w:val="Paragraphedeliste"/>
+        <w:numPr>
+          <w:ilvl w:val="0"/>
+          <w:numId w:val="12"/>
+        </w:numPr>
+        <w:spacing w:after="150" w:line="360" w:lineRule="auto"/>
+        <w:jc w:val="both"/>
+        <w:rPr>
+          <w:sz w:val="24"/>
+          <w:szCs w:val="24"/>
+        </w:rPr>
+      </w:pPr>
+      <w:r>
+        <w:rPr>
+          <w:rStyle w:val="Accentuation"/>
+          <w:i w:val="0"/>
+          <w:iCs w:val="0"/>
+          <w:sz w:val="24"/>
+          <w:szCs w:val="24"/>
+        </w:rPr>
+        <w:t>Renouvellement de session et déconnexion</w:t>
+      </w:r>
+    </w:p>
+    <w:p>
+      <w:pPr>
+        <w:pStyle w:val="Paragraphedeliste"/>
+        <w:numPr>
+          <w:ilvl w:val="0"/>
+          <w:numId w:val="12"/>
+        </w:numPr>
+        <w:spacing w:after="150" w:line="360" w:lineRule="auto"/>
+        <w:jc w:val="both"/>
+        <w:rPr>
+          <w:sz w:val="24"/>
+          <w:szCs w:val="24"/>
+        </w:rPr>
+      </w:pPr>
+      <w:r>
+        <w:rPr>
+          <w:rStyle w:val="Accentuation"/>
+          <w:i w:val="0"/>
+          <w:iCs w:val="0"/>
+          <w:sz w:val="24"/>
+          <w:szCs w:val="24"/>
+        </w:rPr>
+        <w:t>Recherche, filtrage et pagination des listes</w:t>
+      </w:r>
+    </w:p>
+    <w:p>
+      <w:pPr>
+        <w:pStyle w:val="Paragraphedeliste"/>
+        <w:numPr>
+          <w:ilvl w:val="0"/>
+          <w:numId w:val="12"/>
+        </w:numPr>
+        <w:spacing w:after="150" w:line="360" w:lineRule="auto"/>
+        <w:jc w:val="both"/>
+        <w:rPr>
+          <w:sz w:val="24"/>
+          <w:szCs w:val="24"/>
+        </w:rPr>
+      </w:pPr>
+      <w:r>
+        <w:rPr>
+          <w:sz w:val="24"/>
+          <w:szCs w:val="24"/>
+        </w:rPr>
+        <w:lastRenderedPageBreak/>
+        <w:t xml:space="preserve"> </w:t>
+      </w:r>
+      <w:r>
+        <w:rPr>
+          <w:rStyle w:val="Accentuation"/>
+          <w:i w:val="0"/>
+          <w:iCs w:val="0"/>
+          <w:sz w:val="24"/>
+          <w:szCs w:val="24"/>
+        </w:rPr>
+        <w:t>Progression d’une tirelire</w:t>
+      </w:r>
+    </w:p>
+    <w:p>
+      <w:pPr>
+        <w:pStyle w:val="Paragraphedeliste"/>
+        <w:numPr>
+          <w:ilvl w:val="0"/>
+          <w:numId w:val="12"/>
+        </w:numPr>
+        <w:spacing w:after="150" w:line="360" w:lineRule="auto"/>
+        <w:jc w:val="both"/>
+        <w:rPr>
+          <w:sz w:val="24"/>
+          <w:szCs w:val="24"/>
+        </w:rPr>
+      </w:pPr>
+      <w:r>
+        <w:rPr>
+          <w:rStyle w:val="Accentuation"/>
+          <w:i w:val="0"/>
+          <w:iCs w:val="0"/>
+          <w:sz w:val="24"/>
+          <w:szCs w:val="24"/>
+        </w:rPr>
+        <w:t>Administration des comptes clients (rôle administrateur)</w:t>
+      </w:r>
+      <w:bookmarkStart w:id="38" w:name="_Toc238413442"/>
+    </w:p>
+    <w:p>
+      <w:pPr>
         <w:pStyle w:val="Titre1"/>
         <w:spacing w:line="360" w:lineRule="auto"/>
         <w:jc w:val="both"/>
         <w:rPr>
           <w:b/>
           <w:bCs/>
-        </w:rPr>
-      </w:pPr>
-      <w:bookmarkStart w:id="38" w:name="_Toc238413442"/>
+          <w:sz w:val="10"/>
+          <w:szCs w:val="10"/>
+        </w:rPr>
+      </w:pPr>
     </w:p>
     <w:p>
       <w:pPr>
@@ -2801,25 +3092,13 @@
           <w:bCs/>
         </w:rPr>
       </w:pPr>
-    </w:p>
-    <w:p>
-      <w:pPr>
-        <w:pStyle w:val="Titre1"/>
-        <w:spacing w:line="360" w:lineRule="auto"/>
-        <w:jc w:val="both"/>
+      <w:bookmarkStart w:id="39" w:name="_Toc238986082"/>
+      <w:bookmarkStart w:id="40" w:name="_Toc243773204"/>
+      <w:r>
         <w:rPr>
           <w:b/>
           <w:bCs/>
         </w:rPr>
-      </w:pPr>
-      <w:bookmarkStart w:id="39" w:name="_Toc238986032"/>
-      <w:bookmarkStart w:id="40" w:name="_Toc238986082"/>
-      <w:r>
-        <w:rPr>
-          <w:b/>
-          <w:bCs/>
-        </w:rPr>
-        <w:lastRenderedPageBreak/>
         <w:t>5.</w:t>
       </w:r>
       <w:r>
@@ -2856,8 +3135,8 @@
       <w:bookmarkStart w:id="41" w:name="_Toc238412453"/>
       <w:bookmarkStart w:id="42" w:name="_Toc238413370"/>
       <w:bookmarkStart w:id="43" w:name="_Toc238413443"/>
-      <w:bookmarkStart w:id="44" w:name="_Toc238986033"/>
-      <w:bookmarkStart w:id="45" w:name="_Toc238986083"/>
+      <w:bookmarkStart w:id="44" w:name="_Toc238986083"/>
+      <w:bookmarkStart w:id="45" w:name="_Toc243773205"/>
       <w:r>
         <w:rPr>
           <w:rFonts w:eastAsia="Calibri"/>
@@ -3091,6 +3370,132 @@
     </w:p>
     <w:p>
       <w:pPr>
+        <w:pStyle w:val="Paragraphedeliste"/>
+        <w:numPr>
+          <w:ilvl w:val="0"/>
+          <w:numId w:val="14"/>
+        </w:numPr>
+        <w:spacing w:line="360" w:lineRule="auto"/>
+        <w:jc w:val="both"/>
+        <w:rPr>
+          <w:sz w:val="32"/>
+          <w:szCs w:val="32"/>
+        </w:rPr>
+      </w:pPr>
+      <w:r>
+        <w:rPr>
+          <w:rStyle w:val="Accentuation"/>
+          <w:i w:val="0"/>
+          <w:iCs w:val="0"/>
+          <w:sz w:val="24"/>
+          <w:szCs w:val="24"/>
+        </w:rPr>
+        <w:t>La gestion du cycle de vie des jetons (expiration, renouvellement, déconnexion)</w:t>
+      </w:r>
+    </w:p>
+    <w:p>
+      <w:pPr>
+        <w:pStyle w:val="Paragraphedeliste"/>
+        <w:numPr>
+          <w:ilvl w:val="0"/>
+          <w:numId w:val="14"/>
+        </w:numPr>
+        <w:spacing w:line="360" w:lineRule="auto"/>
+        <w:jc w:val="both"/>
+        <w:rPr>
+          <w:sz w:val="32"/>
+          <w:szCs w:val="32"/>
+        </w:rPr>
+      </w:pPr>
+      <w:r>
+        <w:rPr>
+          <w:sz w:val="24"/>
+          <w:szCs w:val="24"/>
+        </w:rPr>
+        <w:t xml:space="preserve"> </w:t>
+      </w:r>
+      <w:r>
+        <w:rPr>
+          <w:rStyle w:val="Accentuation"/>
+          <w:i w:val="0"/>
+          <w:iCs w:val="0"/>
+          <w:sz w:val="24"/>
+          <w:szCs w:val="24"/>
+        </w:rPr>
+        <w:t>L’administration des comptes clients</w:t>
+      </w:r>
+    </w:p>
+    <w:p>
+      <w:pPr>
+        <w:pStyle w:val="Paragraphedeliste"/>
+        <w:numPr>
+          <w:ilvl w:val="0"/>
+          <w:numId w:val="14"/>
+        </w:numPr>
+        <w:spacing w:line="360" w:lineRule="auto"/>
+        <w:jc w:val="both"/>
+        <w:rPr>
+          <w:sz w:val="32"/>
+          <w:szCs w:val="32"/>
+        </w:rPr>
+      </w:pPr>
+      <w:r>
+        <w:rPr>
+          <w:rStyle w:val="Accentuation"/>
+          <w:i w:val="0"/>
+          <w:iCs w:val="0"/>
+          <w:sz w:val="24"/>
+          <w:szCs w:val="24"/>
+        </w:rPr>
+        <w:t>La documentation interactive de l’API (</w:t>
+      </w:r>
+      <w:proofErr w:type="spellStart"/>
+      <w:r>
+        <w:rPr>
+          <w:rStyle w:val="Accentuation"/>
+          <w:i w:val="0"/>
+          <w:iCs w:val="0"/>
+          <w:sz w:val="24"/>
+          <w:szCs w:val="24"/>
+        </w:rPr>
+        <w:t>OpenAPI</w:t>
+      </w:r>
+      <w:proofErr w:type="spellEnd"/>
+      <w:r>
+        <w:rPr>
+          <w:rStyle w:val="Accentuation"/>
+          <w:i w:val="0"/>
+          <w:iCs w:val="0"/>
+          <w:sz w:val="24"/>
+          <w:szCs w:val="24"/>
+        </w:rPr>
+        <w:t xml:space="preserve"> / </w:t>
+      </w:r>
+      <w:proofErr w:type="spellStart"/>
+      <w:r>
+        <w:rPr>
+          <w:rStyle w:val="Accentuation"/>
+          <w:i w:val="0"/>
+          <w:iCs w:val="0"/>
+          <w:sz w:val="24"/>
+          <w:szCs w:val="24"/>
+        </w:rPr>
+        <w:t>Swagger</w:t>
+      </w:r>
+      <w:proofErr w:type="spellEnd"/>
+      <w:r>
+        <w:rPr>
+          <w:rStyle w:val="Accentuation"/>
+          <w:i w:val="0"/>
+          <w:iCs w:val="0"/>
+          <w:sz w:val="24"/>
+          <w:szCs w:val="24"/>
+        </w:rPr>
+        <w:t xml:space="preserve"> UI)</w:t>
+      </w:r>
+    </w:p>
+    <w:p>
+      <w:pPr>
         <w:pStyle w:val="Titre2"/>
         <w:spacing w:before="300" w:after="150" w:line="360" w:lineRule="auto"/>
         <w:ind w:firstLine="360"/>
@@ -3103,8 +3508,8 @@
       <w:bookmarkStart w:id="46" w:name="_Toc238412454"/>
       <w:bookmarkStart w:id="47" w:name="_Toc238413371"/>
       <w:bookmarkStart w:id="48" w:name="_Toc238413444"/>
-      <w:bookmarkStart w:id="49" w:name="_Toc238986034"/>
-      <w:bookmarkStart w:id="50" w:name="_Toc238986084"/>
+      <w:bookmarkStart w:id="49" w:name="_Toc238986084"/>
+      <w:bookmarkStart w:id="50" w:name="_Toc243773206"/>
       <w:r>
         <w:rPr>
           <w:rFonts w:eastAsia="Calibri"/>
@@ -3247,8 +3652,8 @@
         </w:rPr>
       </w:pPr>
       <w:bookmarkStart w:id="51" w:name="_Toc238413445"/>
-      <w:bookmarkStart w:id="52" w:name="_Toc238986035"/>
-      <w:bookmarkStart w:id="53" w:name="_Toc238986085"/>
+      <w:bookmarkStart w:id="52" w:name="_Toc238986085"/>
+      <w:bookmarkStart w:id="53" w:name="_Toc243773207"/>
       <w:r>
         <w:rPr>
           <w:b/>
@@ -3294,8 +3699,8 @@
       <w:bookmarkStart w:id="54" w:name="_Toc238412456"/>
       <w:bookmarkStart w:id="55" w:name="_Toc238413373"/>
       <w:bookmarkStart w:id="56" w:name="_Toc238413446"/>
-      <w:bookmarkStart w:id="57" w:name="_Toc238986036"/>
-      <w:bookmarkStart w:id="58" w:name="_Toc238986086"/>
+      <w:bookmarkStart w:id="57" w:name="_Toc238986086"/>
+      <w:bookmarkStart w:id="58" w:name="_Toc243773208"/>
       <w:r>
         <w:rPr>
           <w:rFonts w:eastAsia="Calibri"/>
@@ -3443,87 +3848,6 @@
     </w:p>
     <w:p>
       <w:pPr>
-        <w:pStyle w:val="Titre2"/>
-        <w:spacing w:before="300" w:after="150" w:line="360" w:lineRule="auto"/>
-        <w:jc w:val="both"/>
-        <w:rPr>
-          <w:sz w:val="28"/>
-          <w:szCs w:val="28"/>
-        </w:rPr>
-      </w:pPr>
-      <w:bookmarkStart w:id="59" w:name="_Toc238412457"/>
-      <w:bookmarkStart w:id="60" w:name="_Toc238413374"/>
-      <w:bookmarkStart w:id="61" w:name="_Toc238413447"/>
-      <w:r>
-        <w:rPr>
-          <w:rFonts w:eastAsia="Calibri"/>
-          <w:b/>
-          <w:bCs/>
-          <w:sz w:val="28"/>
-          <w:szCs w:val="28"/>
-        </w:rPr>
-        <w:t xml:space="preserve">     </w:t>
-      </w:r>
-      <w:bookmarkStart w:id="62" w:name="_Toc238986037"/>
-      <w:bookmarkStart w:id="63" w:name="_Toc238986087"/>
-      <w:r>
-        <w:rPr>
-          <w:rFonts w:eastAsia="Calibri"/>
-          <w:b/>
-          <w:bCs/>
-          <w:sz w:val="28"/>
-          <w:szCs w:val="28"/>
-        </w:rPr>
-        <w:t>6</w:t>
-      </w:r>
-      <w:r>
-        <w:rPr>
-          <w:rFonts w:eastAsia="Calibri"/>
-          <w:b/>
-          <w:bCs/>
-          <w:sz w:val="28"/>
-          <w:szCs w:val="28"/>
-        </w:rPr>
-        <w:t>.</w:t>
-      </w:r>
-      <w:r>
-        <w:rPr>
-          <w:rFonts w:eastAsia="Calibri"/>
-          <w:b/>
-          <w:bCs/>
-          <w:sz w:val="28"/>
-          <w:szCs w:val="28"/>
-        </w:rPr>
-        <w:t>2</w:t>
-      </w:r>
-      <w:r>
-        <w:rPr>
-          <w:rFonts w:eastAsia="Calibri"/>
-          <w:b/>
-          <w:bCs/>
-          <w:sz w:val="28"/>
-          <w:szCs w:val="28"/>
-        </w:rPr>
-        <w:t xml:space="preserve"> </w:t>
-      </w:r>
-      <w:r>
-        <w:rPr>
-          <w:rFonts w:eastAsia="Calibri"/>
-          <w:b/>
-          <w:bCs/>
-          <w:sz w:val="28"/>
-          <w:szCs w:val="28"/>
-        </w:rPr>
-        <w:t>Contraintes de représentation des données</w:t>
-      </w:r>
-      <w:bookmarkEnd w:id="59"/>
-      <w:bookmarkEnd w:id="60"/>
-      <w:bookmarkEnd w:id="61"/>
-      <w:bookmarkEnd w:id="62"/>
-      <w:bookmarkEnd w:id="63"/>
-    </w:p>
-    <w:p>
-      <w:pPr>
         <w:pStyle w:val="Paragraphedeliste"/>
         <w:numPr>
           <w:ilvl w:val="0"/>
@@ -3532,122 +3856,41 @@
         <w:spacing w:line="360" w:lineRule="auto"/>
         <w:jc w:val="both"/>
         <w:rPr>
-          <w:sz w:val="24"/>
-          <w:szCs w:val="24"/>
-        </w:rPr>
-      </w:pPr>
-      <w:r>
-        <w:rPr>
-          <w:sz w:val="24"/>
-          <w:szCs w:val="24"/>
-        </w:rPr>
-        <w:t>Les sommes d'argent doivent être représentées avec un type décimal (</w:t>
+          <w:sz w:val="32"/>
+          <w:szCs w:val="32"/>
+        </w:rPr>
+      </w:pPr>
+      <w:r>
+        <w:rPr>
+          <w:rStyle w:val="Accentuation"/>
+          <w:i w:val="0"/>
+          <w:iCs w:val="0"/>
+          <w:sz w:val="24"/>
+          <w:szCs w:val="24"/>
+        </w:rPr>
+        <w:t>Authentification : JWT (</w:t>
       </w:r>
       <w:proofErr w:type="spellStart"/>
       <w:r>
         <w:rPr>
-          <w:rStyle w:val="CodeHTML"/>
-          <w:rFonts w:ascii="Times New Roman" w:hAnsi="Times New Roman" w:cs="Times New Roman"/>
-          <w:sz w:val="24"/>
-          <w:szCs w:val="24"/>
-        </w:rPr>
-        <w:t>Decimal</w:t>
+          <w:rStyle w:val="Accentuation"/>
+          <w:i w:val="0"/>
+          <w:iCs w:val="0"/>
+          <w:sz w:val="24"/>
+          <w:szCs w:val="24"/>
+        </w:rPr>
+        <w:t>djangorestframework-simplejwt</w:t>
       </w:r>
       <w:proofErr w:type="spellEnd"/>
       <w:r>
         <w:rPr>
-          <w:sz w:val="24"/>
-          <w:szCs w:val="24"/>
-        </w:rPr>
-        <w:t>), jamais avec un nombre à virgule flottante, afin d'éviter les erreurs d'arrondi inhérentes à la représentation binaire des flottants.</w:t>
-      </w:r>
-    </w:p>
-    <w:p>
-      <w:pPr>
-        <w:pStyle w:val="Titre2"/>
-        <w:spacing w:before="300" w:after="150" w:line="360" w:lineRule="auto"/>
-        <w:jc w:val="both"/>
-        <w:rPr>
-          <w:sz w:val="28"/>
-          <w:szCs w:val="28"/>
-        </w:rPr>
-      </w:pPr>
-      <w:bookmarkStart w:id="64" w:name="_Toc238412458"/>
-      <w:bookmarkStart w:id="65" w:name="_Toc238413375"/>
-      <w:bookmarkStart w:id="66" w:name="_Toc238413448"/>
-      <w:r>
-        <w:rPr>
-          <w:rFonts w:eastAsia="Calibri"/>
-          <w:b/>
-          <w:bCs/>
-          <w:sz w:val="28"/>
-          <w:szCs w:val="28"/>
-        </w:rPr>
-        <w:t xml:space="preserve">     </w:t>
-      </w:r>
-      <w:bookmarkStart w:id="67" w:name="_Toc238986038"/>
-      <w:bookmarkStart w:id="68" w:name="_Toc238986088"/>
-      <w:r>
-        <w:rPr>
-          <w:rFonts w:eastAsia="Calibri"/>
-          <w:b/>
-          <w:bCs/>
-          <w:sz w:val="28"/>
-          <w:szCs w:val="28"/>
-        </w:rPr>
-        <w:t>6</w:t>
-      </w:r>
-      <w:r>
-        <w:rPr>
-          <w:rFonts w:eastAsia="Calibri"/>
-          <w:b/>
-          <w:bCs/>
-          <w:sz w:val="28"/>
-          <w:szCs w:val="28"/>
-        </w:rPr>
-        <w:t>.</w:t>
-      </w:r>
-      <w:r>
-        <w:rPr>
-          <w:rFonts w:eastAsia="Calibri"/>
-          <w:b/>
-          <w:bCs/>
-          <w:sz w:val="28"/>
-          <w:szCs w:val="28"/>
-        </w:rPr>
-        <w:t>3</w:t>
-      </w:r>
-      <w:r>
-        <w:rPr>
-          <w:rFonts w:eastAsia="Calibri"/>
-          <w:b/>
-          <w:bCs/>
-          <w:sz w:val="28"/>
-          <w:szCs w:val="28"/>
-        </w:rPr>
-        <w:t xml:space="preserve"> </w:t>
-      </w:r>
-      <w:r>
-        <w:rPr>
-          <w:rFonts w:eastAsia="Calibri"/>
-          <w:b/>
-          <w:bCs/>
-          <w:sz w:val="28"/>
-          <w:szCs w:val="28"/>
-        </w:rPr>
-        <w:t>Contraintes de délai</w:t>
-      </w:r>
-      <w:bookmarkEnd w:id="64"/>
-      <w:bookmarkEnd w:id="65"/>
-      <w:bookmarkEnd w:id="66"/>
-      <w:bookmarkEnd w:id="67"/>
-      <w:bookmarkEnd w:id="68"/>
-      <w:r>
-        <w:rPr>
-          <w:sz w:val="24"/>
-          <w:szCs w:val="24"/>
-        </w:rPr>
-        <w:t xml:space="preserve"> </w:t>
+          <w:rStyle w:val="Accentuation"/>
+          <w:i w:val="0"/>
+          <w:iCs w:val="0"/>
+          <w:sz w:val="24"/>
+          <w:szCs w:val="24"/>
+        </w:rPr>
+        <w:t>)</w:t>
       </w:r>
     </w:p>
     <w:p>
@@ -3660,104 +3903,70 @@
         <w:spacing w:line="360" w:lineRule="auto"/>
         <w:jc w:val="both"/>
         <w:rPr>
-          <w:sz w:val="24"/>
-          <w:szCs w:val="24"/>
-        </w:rPr>
-      </w:pPr>
-      <w:r>
-        <w:rPr>
-          <w:sz w:val="24"/>
-          <w:szCs w:val="24"/>
-        </w:rPr>
-        <w:t>Durée totale : 2 mois, dont 4 semaines de développement structuré, le reste étant consacré à la consolidation, aux tests approfondis et à la préparation de la restitution finale.</w:t>
-      </w:r>
-    </w:p>
-    <w:p>
-      <w:pPr>
-        <w:pStyle w:val="Titre2"/>
-        <w:spacing w:before="300" w:after="150" w:line="360" w:lineRule="auto"/>
-        <w:jc w:val="both"/>
-        <w:rPr>
-          <w:sz w:val="28"/>
-          <w:szCs w:val="28"/>
-        </w:rPr>
-      </w:pPr>
-      <w:bookmarkStart w:id="69" w:name="_Toc238412459"/>
-      <w:bookmarkStart w:id="70" w:name="_Toc238413376"/>
-      <w:bookmarkStart w:id="71" w:name="_Toc238413449"/>
-      <w:r>
-        <w:rPr>
-          <w:rFonts w:eastAsia="Calibri"/>
-          <w:b/>
-          <w:bCs/>
-          <w:sz w:val="28"/>
-          <w:szCs w:val="28"/>
-        </w:rPr>
-        <w:t xml:space="preserve">     </w:t>
-      </w:r>
-      <w:bookmarkStart w:id="72" w:name="_Toc238986039"/>
-      <w:bookmarkStart w:id="73" w:name="_Toc238986089"/>
-      <w:r>
-        <w:rPr>
-          <w:rFonts w:eastAsia="Calibri"/>
-          <w:b/>
-          <w:bCs/>
-          <w:sz w:val="28"/>
-          <w:szCs w:val="28"/>
-        </w:rPr>
-        <w:t>6</w:t>
-      </w:r>
-      <w:r>
-        <w:rPr>
-          <w:rFonts w:eastAsia="Calibri"/>
-          <w:b/>
-          <w:bCs/>
-          <w:sz w:val="28"/>
-          <w:szCs w:val="28"/>
-        </w:rPr>
-        <w:t>.</w:t>
-      </w:r>
-      <w:r>
-        <w:rPr>
-          <w:rFonts w:eastAsia="Calibri"/>
-          <w:b/>
-          <w:bCs/>
-          <w:sz w:val="28"/>
-          <w:szCs w:val="28"/>
-        </w:rPr>
-        <w:t>4</w:t>
-      </w:r>
-      <w:r>
-        <w:rPr>
-          <w:rFonts w:eastAsia="Calibri"/>
-          <w:b/>
-          <w:bCs/>
-          <w:sz w:val="28"/>
-          <w:szCs w:val="28"/>
+          <w:sz w:val="32"/>
+          <w:szCs w:val="32"/>
+        </w:rPr>
+      </w:pPr>
+      <w:r>
+        <w:rPr>
+          <w:sz w:val="24"/>
+          <w:szCs w:val="24"/>
         </w:rPr>
         <w:t xml:space="preserve"> </w:t>
       </w:r>
       <w:r>
         <w:rPr>
-          <w:rFonts w:eastAsia="Calibri"/>
-          <w:b/>
-          <w:bCs/>
-          <w:sz w:val="28"/>
-          <w:szCs w:val="28"/>
-        </w:rPr>
-        <w:t>Contraintes organisationnelles</w:t>
-      </w:r>
-      <w:bookmarkEnd w:id="69"/>
-      <w:bookmarkEnd w:id="70"/>
-      <w:bookmarkEnd w:id="71"/>
-      <w:bookmarkEnd w:id="72"/>
-      <w:bookmarkEnd w:id="73"/>
-      <w:r>
-        <w:rPr>
-          <w:sz w:val="24"/>
-          <w:szCs w:val="24"/>
-        </w:rPr>
-        <w:t xml:space="preserve"> </w:t>
+          <w:rStyle w:val="Accentuation"/>
+          <w:i w:val="0"/>
+          <w:iCs w:val="0"/>
+          <w:sz w:val="24"/>
+          <w:szCs w:val="24"/>
+        </w:rPr>
+        <w:t xml:space="preserve">Documentation : </w:t>
+      </w:r>
+      <w:proofErr w:type="spellStart"/>
+      <w:r>
+        <w:rPr>
+          <w:rStyle w:val="Accentuation"/>
+          <w:i w:val="0"/>
+          <w:iCs w:val="0"/>
+          <w:sz w:val="24"/>
+          <w:szCs w:val="24"/>
+        </w:rPr>
+        <w:t>OpenAPI</w:t>
+      </w:r>
+      <w:proofErr w:type="spellEnd"/>
+      <w:r>
+        <w:rPr>
+          <w:rStyle w:val="Accentuation"/>
+          <w:i w:val="0"/>
+          <w:iCs w:val="0"/>
+          <w:sz w:val="24"/>
+          <w:szCs w:val="24"/>
+        </w:rPr>
+        <w:t xml:space="preserve"> (</w:t>
+      </w:r>
+      <w:proofErr w:type="spellStart"/>
+      <w:r>
+        <w:rPr>
+          <w:rStyle w:val="Accentuation"/>
+          <w:i w:val="0"/>
+          <w:iCs w:val="0"/>
+          <w:sz w:val="24"/>
+          <w:szCs w:val="24"/>
+        </w:rPr>
+        <w:t>drf-spectacular</w:t>
+      </w:r>
+      <w:proofErr w:type="spellEnd"/>
+      <w:r>
+        <w:rPr>
+          <w:rStyle w:val="Accentuation"/>
+          <w:i w:val="0"/>
+          <w:iCs w:val="0"/>
+          <w:sz w:val="24"/>
+          <w:szCs w:val="24"/>
+        </w:rPr>
+        <w:t>)</w:t>
       </w:r>
     </w:p>
     <w:p>
@@ -3770,6 +3979,393 @@
         <w:spacing w:line="360" w:lineRule="auto"/>
         <w:jc w:val="both"/>
         <w:rPr>
+          <w:rStyle w:val="Accentuation"/>
+          <w:i w:val="0"/>
+          <w:iCs w:val="0"/>
+          <w:sz w:val="32"/>
+          <w:szCs w:val="32"/>
+        </w:rPr>
+      </w:pPr>
+      <w:r>
+        <w:rPr>
+          <w:sz w:val="24"/>
+          <w:szCs w:val="24"/>
+        </w:rPr>
+        <w:t xml:space="preserve"> </w:t>
+      </w:r>
+      <w:r>
+        <w:rPr>
+          <w:rStyle w:val="Accentuation"/>
+          <w:i w:val="0"/>
+          <w:iCs w:val="0"/>
+          <w:sz w:val="24"/>
+          <w:szCs w:val="24"/>
+        </w:rPr>
+        <w:t xml:space="preserve">Filtrage : </w:t>
+      </w:r>
+      <w:proofErr w:type="spellStart"/>
+      <w:r>
+        <w:rPr>
+          <w:rStyle w:val="Accentuation"/>
+          <w:i w:val="0"/>
+          <w:iCs w:val="0"/>
+          <w:sz w:val="24"/>
+          <w:szCs w:val="24"/>
+        </w:rPr>
+        <w:t>django-filter</w:t>
+      </w:r>
+      <w:proofErr w:type="spellEnd"/>
+    </w:p>
+    <w:p>
+      <w:pPr>
+        <w:spacing w:line="360" w:lineRule="auto"/>
+        <w:jc w:val="both"/>
+        <w:rPr>
+          <w:sz w:val="32"/>
+          <w:szCs w:val="32"/>
+        </w:rPr>
+      </w:pPr>
+    </w:p>
+    <w:p>
+      <w:pPr>
+        <w:spacing w:line="360" w:lineRule="auto"/>
+        <w:jc w:val="both"/>
+        <w:rPr>
+          <w:sz w:val="32"/>
+          <w:szCs w:val="32"/>
+        </w:rPr>
+      </w:pPr>
+    </w:p>
+    <w:p>
+      <w:pPr>
+        <w:pStyle w:val="Titre2"/>
+        <w:spacing w:before="300" w:after="150" w:line="360" w:lineRule="auto"/>
+        <w:jc w:val="both"/>
+        <w:rPr>
+          <w:sz w:val="28"/>
+          <w:szCs w:val="28"/>
+        </w:rPr>
+      </w:pPr>
+      <w:bookmarkStart w:id="59" w:name="_Toc238412457"/>
+      <w:bookmarkStart w:id="60" w:name="_Toc238413374"/>
+      <w:bookmarkStart w:id="61" w:name="_Toc238413447"/>
+      <w:r>
+        <w:rPr>
+          <w:rFonts w:eastAsia="Calibri"/>
+          <w:b/>
+          <w:bCs/>
+          <w:sz w:val="28"/>
+          <w:szCs w:val="28"/>
+        </w:rPr>
+        <w:lastRenderedPageBreak/>
+        <w:t xml:space="preserve">     </w:t>
+      </w:r>
+      <w:bookmarkStart w:id="62" w:name="_Toc238986087"/>
+      <w:bookmarkStart w:id="63" w:name="_Toc243773209"/>
+      <w:r>
+        <w:rPr>
+          <w:rFonts w:eastAsia="Calibri"/>
+          <w:b/>
+          <w:bCs/>
+          <w:sz w:val="28"/>
+          <w:szCs w:val="28"/>
+        </w:rPr>
+        <w:t>6</w:t>
+      </w:r>
+      <w:r>
+        <w:rPr>
+          <w:rFonts w:eastAsia="Calibri"/>
+          <w:b/>
+          <w:bCs/>
+          <w:sz w:val="28"/>
+          <w:szCs w:val="28"/>
+        </w:rPr>
+        <w:t>.</w:t>
+      </w:r>
+      <w:r>
+        <w:rPr>
+          <w:rFonts w:eastAsia="Calibri"/>
+          <w:b/>
+          <w:bCs/>
+          <w:sz w:val="28"/>
+          <w:szCs w:val="28"/>
+        </w:rPr>
+        <w:t>2</w:t>
+      </w:r>
+      <w:r>
+        <w:rPr>
+          <w:rFonts w:eastAsia="Calibri"/>
+          <w:b/>
+          <w:bCs/>
+          <w:sz w:val="28"/>
+          <w:szCs w:val="28"/>
+        </w:rPr>
+        <w:t xml:space="preserve"> </w:t>
+      </w:r>
+      <w:r>
+        <w:rPr>
+          <w:rFonts w:eastAsia="Calibri"/>
+          <w:b/>
+          <w:bCs/>
+          <w:sz w:val="28"/>
+          <w:szCs w:val="28"/>
+        </w:rPr>
+        <w:t>Contraintes de représentation des données</w:t>
+      </w:r>
+      <w:bookmarkEnd w:id="59"/>
+      <w:bookmarkEnd w:id="60"/>
+      <w:bookmarkEnd w:id="61"/>
+      <w:bookmarkEnd w:id="62"/>
+      <w:bookmarkEnd w:id="63"/>
+    </w:p>
+    <w:p>
+      <w:pPr>
+        <w:pStyle w:val="Paragraphedeliste"/>
+        <w:numPr>
+          <w:ilvl w:val="0"/>
+          <w:numId w:val="15"/>
+        </w:numPr>
+        <w:spacing w:line="360" w:lineRule="auto"/>
+        <w:jc w:val="both"/>
+        <w:rPr>
+          <w:sz w:val="24"/>
+          <w:szCs w:val="24"/>
+        </w:rPr>
+      </w:pPr>
+      <w:r>
+        <w:rPr>
+          <w:sz w:val="24"/>
+          <w:szCs w:val="24"/>
+        </w:rPr>
+        <w:t>Les sommes d'argent doivent être représentées avec un type décimal (</w:t>
+      </w:r>
+      <w:proofErr w:type="spellStart"/>
+      <w:r>
+        <w:rPr>
+          <w:rStyle w:val="CodeHTML"/>
+          <w:rFonts w:ascii="Times New Roman" w:hAnsi="Times New Roman" w:cs="Times New Roman"/>
+          <w:sz w:val="24"/>
+          <w:szCs w:val="24"/>
+        </w:rPr>
+        <w:t>Decimal</w:t>
+      </w:r>
+      <w:proofErr w:type="spellEnd"/>
+      <w:r>
+        <w:rPr>
+          <w:sz w:val="24"/>
+          <w:szCs w:val="24"/>
+        </w:rPr>
+        <w:t>), jamais avec un nombre à virgule flottante, afin d'éviter les erreurs d'arrondi inhérentes à la représentation binaire des flottants.</w:t>
+      </w:r>
+    </w:p>
+    <w:p>
+      <w:pPr>
+        <w:pStyle w:val="Titre2"/>
+        <w:spacing w:before="300" w:after="150" w:line="360" w:lineRule="auto"/>
+        <w:jc w:val="both"/>
+        <w:rPr>
+          <w:sz w:val="28"/>
+          <w:szCs w:val="28"/>
+        </w:rPr>
+      </w:pPr>
+      <w:bookmarkStart w:id="64" w:name="_Toc238412458"/>
+      <w:bookmarkStart w:id="65" w:name="_Toc238413375"/>
+      <w:bookmarkStart w:id="66" w:name="_Toc238413448"/>
+      <w:r>
+        <w:rPr>
+          <w:rFonts w:eastAsia="Calibri"/>
+          <w:b/>
+          <w:bCs/>
+          <w:sz w:val="28"/>
+          <w:szCs w:val="28"/>
+        </w:rPr>
+        <w:t xml:space="preserve">     </w:t>
+      </w:r>
+      <w:bookmarkStart w:id="67" w:name="_Toc238986088"/>
+      <w:bookmarkStart w:id="68" w:name="_Toc243773210"/>
+      <w:r>
+        <w:rPr>
+          <w:rFonts w:eastAsia="Calibri"/>
+          <w:b/>
+          <w:bCs/>
+          <w:sz w:val="28"/>
+          <w:szCs w:val="28"/>
+        </w:rPr>
+        <w:t>6</w:t>
+      </w:r>
+      <w:r>
+        <w:rPr>
+          <w:rFonts w:eastAsia="Calibri"/>
+          <w:b/>
+          <w:bCs/>
+          <w:sz w:val="28"/>
+          <w:szCs w:val="28"/>
+        </w:rPr>
+        <w:t>.</w:t>
+      </w:r>
+      <w:r>
+        <w:rPr>
+          <w:rFonts w:eastAsia="Calibri"/>
+          <w:b/>
+          <w:bCs/>
+          <w:sz w:val="28"/>
+          <w:szCs w:val="28"/>
+        </w:rPr>
+        <w:t>3</w:t>
+      </w:r>
+      <w:r>
+        <w:rPr>
+          <w:rFonts w:eastAsia="Calibri"/>
+          <w:b/>
+          <w:bCs/>
+          <w:sz w:val="28"/>
+          <w:szCs w:val="28"/>
+        </w:rPr>
+        <w:t xml:space="preserve"> </w:t>
+      </w:r>
+      <w:r>
+        <w:rPr>
+          <w:rFonts w:eastAsia="Calibri"/>
+          <w:b/>
+          <w:bCs/>
+          <w:sz w:val="28"/>
+          <w:szCs w:val="28"/>
+        </w:rPr>
+        <w:t>Contraintes de délai</w:t>
+      </w:r>
+      <w:bookmarkEnd w:id="64"/>
+      <w:bookmarkEnd w:id="65"/>
+      <w:bookmarkEnd w:id="66"/>
+      <w:bookmarkEnd w:id="67"/>
+      <w:bookmarkEnd w:id="68"/>
+      <w:r>
+        <w:rPr>
+          <w:sz w:val="24"/>
+          <w:szCs w:val="24"/>
+        </w:rPr>
+        <w:t xml:space="preserve"> </w:t>
+      </w:r>
+    </w:p>
+    <w:p>
+      <w:pPr>
+        <w:pStyle w:val="Paragraphedeliste"/>
+        <w:numPr>
+          <w:ilvl w:val="0"/>
+          <w:numId w:val="15"/>
+        </w:numPr>
+        <w:spacing w:line="360" w:lineRule="auto"/>
+        <w:jc w:val="both"/>
+        <w:rPr>
+          <w:sz w:val="24"/>
+          <w:szCs w:val="24"/>
+        </w:rPr>
+      </w:pPr>
+      <w:r>
+        <w:rPr>
+          <w:sz w:val="24"/>
+          <w:szCs w:val="24"/>
+        </w:rPr>
+        <w:t>Durée totale : 2 mois, dont 4 semaines de développement structuré, le reste étant consacré à la consolidation, aux tests approfondis et à la préparation de la restitution finale.</w:t>
+      </w:r>
+    </w:p>
+    <w:p>
+      <w:pPr>
+        <w:pStyle w:val="Titre2"/>
+        <w:spacing w:before="300" w:after="150" w:line="360" w:lineRule="auto"/>
+        <w:jc w:val="both"/>
+        <w:rPr>
+          <w:sz w:val="28"/>
+          <w:szCs w:val="28"/>
+        </w:rPr>
+      </w:pPr>
+      <w:bookmarkStart w:id="69" w:name="_Toc238412459"/>
+      <w:bookmarkStart w:id="70" w:name="_Toc238413376"/>
+      <w:bookmarkStart w:id="71" w:name="_Toc238413449"/>
+      <w:r>
+        <w:rPr>
+          <w:rFonts w:eastAsia="Calibri"/>
+          <w:b/>
+          <w:bCs/>
+          <w:sz w:val="28"/>
+          <w:szCs w:val="28"/>
+        </w:rPr>
+        <w:t xml:space="preserve">     </w:t>
+      </w:r>
+      <w:bookmarkStart w:id="72" w:name="_Toc238986089"/>
+      <w:bookmarkStart w:id="73" w:name="_Toc243773211"/>
+      <w:r>
+        <w:rPr>
+          <w:rFonts w:eastAsia="Calibri"/>
+          <w:b/>
+          <w:bCs/>
+          <w:sz w:val="28"/>
+          <w:szCs w:val="28"/>
+        </w:rPr>
+        <w:t>6</w:t>
+      </w:r>
+      <w:r>
+        <w:rPr>
+          <w:rFonts w:eastAsia="Calibri"/>
+          <w:b/>
+          <w:bCs/>
+          <w:sz w:val="28"/>
+          <w:szCs w:val="28"/>
+        </w:rPr>
+        <w:t>.</w:t>
+      </w:r>
+      <w:r>
+        <w:rPr>
+          <w:rFonts w:eastAsia="Calibri"/>
+          <w:b/>
+          <w:bCs/>
+          <w:sz w:val="28"/>
+          <w:szCs w:val="28"/>
+        </w:rPr>
+        <w:t>4</w:t>
+      </w:r>
+      <w:r>
+        <w:rPr>
+          <w:rFonts w:eastAsia="Calibri"/>
+          <w:b/>
+          <w:bCs/>
+          <w:sz w:val="28"/>
+          <w:szCs w:val="28"/>
+        </w:rPr>
+        <w:t xml:space="preserve"> </w:t>
+      </w:r>
+      <w:r>
+        <w:rPr>
+          <w:rFonts w:eastAsia="Calibri"/>
+          <w:b/>
+          <w:bCs/>
+          <w:sz w:val="28"/>
+          <w:szCs w:val="28"/>
+        </w:rPr>
+        <w:t>Contraintes organisationnelles</w:t>
+      </w:r>
+      <w:bookmarkEnd w:id="69"/>
+      <w:bookmarkEnd w:id="70"/>
+      <w:bookmarkEnd w:id="71"/>
+      <w:bookmarkEnd w:id="72"/>
+      <w:bookmarkEnd w:id="73"/>
+      <w:r>
+        <w:rPr>
+          <w:sz w:val="24"/>
+          <w:szCs w:val="24"/>
+        </w:rPr>
+        <w:t xml:space="preserve"> </w:t>
+      </w:r>
+    </w:p>
+    <w:p>
+      <w:pPr>
+        <w:pStyle w:val="Paragraphedeliste"/>
+        <w:numPr>
+          <w:ilvl w:val="0"/>
+          <w:numId w:val="15"/>
+        </w:numPr>
+        <w:spacing w:line="360" w:lineRule="auto"/>
+        <w:jc w:val="both"/>
+        <w:rPr>
           <w:sz w:val="24"/>
           <w:szCs w:val="24"/>
         </w:rPr>
@@ -3803,8 +4399,8 @@
         <w:jc w:val="both"/>
       </w:pPr>
       <w:bookmarkStart w:id="74" w:name="_Toc238413450"/>
-      <w:bookmarkStart w:id="75" w:name="_Toc238986040"/>
-      <w:bookmarkStart w:id="76" w:name="_Toc238986090"/>
+      <w:bookmarkStart w:id="75" w:name="_Toc238986090"/>
+      <w:bookmarkStart w:id="76" w:name="_Toc243773212"/>
       <w:r>
         <w:rPr>
           <w:rFonts w:eastAsia="Calibri"/>
@@ -3813,7 +4409,6 @@
           <w:sz w:val="30"/>
           <w:szCs w:val="30"/>
         </w:rPr>
-        <w:lastRenderedPageBreak/>
         <w:t>7</w:t>
       </w:r>
       <w:r>
@@ -4013,6 +4608,64 @@
     </w:p>
     <w:p>
       <w:pPr>
+        <w:pStyle w:val="Paragraphedeliste"/>
+        <w:numPr>
+          <w:ilvl w:val="0"/>
+          <w:numId w:val="16"/>
+        </w:numPr>
+        <w:spacing w:after="150" w:line="360" w:lineRule="auto"/>
+        <w:jc w:val="both"/>
+        <w:rPr>
+          <w:i/>
+          <w:iCs/>
+          <w:sz w:val="24"/>
+          <w:szCs w:val="24"/>
+        </w:rPr>
+      </w:pPr>
+      <w:r>
+        <w:rPr>
+          <w:rStyle w:val="Accentuation"/>
+          <w:i w:val="0"/>
+          <w:iCs w:val="0"/>
+          <w:sz w:val="24"/>
+          <w:szCs w:val="24"/>
+        </w:rPr>
+        <w:t>Une documentation interactive de l’API (</w:t>
+      </w:r>
+      <w:proofErr w:type="spellStart"/>
+      <w:r>
+        <w:rPr>
+          <w:rStyle w:val="Accentuation"/>
+          <w:i w:val="0"/>
+          <w:iCs w:val="0"/>
+          <w:sz w:val="24"/>
+          <w:szCs w:val="24"/>
+        </w:rPr>
+        <w:t>Swagger</w:t>
+      </w:r>
+      <w:proofErr w:type="spellEnd"/>
+      <w:r>
+        <w:rPr>
+          <w:rStyle w:val="Accentuation"/>
+          <w:i w:val="0"/>
+          <w:iCs w:val="0"/>
+          <w:sz w:val="24"/>
+          <w:szCs w:val="24"/>
+        </w:rPr>
+        <w:t xml:space="preserve"> UI)</w:t>
+      </w:r>
+      <w:r>
+        <w:rPr>
+          <w:i/>
+          <w:iCs/>
+          <w:sz w:val="24"/>
+          <w:szCs w:val="24"/>
+        </w:rPr>
+        <w:t>.</w:t>
+      </w:r>
+    </w:p>
+    <w:p>
+      <w:pPr>
         <w:pStyle w:val="Titre1"/>
         <w:spacing w:before="400" w:after="200" w:line="360" w:lineRule="auto"/>
         <w:jc w:val="both"/>
@@ -4025,8 +4678,8 @@
         </w:rPr>
       </w:pPr>
       <w:bookmarkStart w:id="77" w:name="_Toc238413451"/>
-      <w:bookmarkStart w:id="78" w:name="_Toc238986041"/>
-      <w:bookmarkStart w:id="79" w:name="_Toc238986091"/>
+      <w:bookmarkStart w:id="78" w:name="_Toc238986091"/>
+      <w:bookmarkStart w:id="79" w:name="_Toc243773213"/>
       <w:r>
         <w:rPr>
           <w:rFonts w:eastAsia="Calibri"/>
@@ -4221,6 +4874,7 @@
           <w:sz w:val="24"/>
           <w:szCs w:val="24"/>
         </w:rPr>
+        <w:lastRenderedPageBreak/>
         <w:t>Seront également appréciés la lisibilité du code, la pertinence du placement des règles métier, et la qualité des messages rendus à l'appelant.</w:t>
       </w:r>
     </w:p>
@@ -4238,8 +4892,8 @@
         </w:rPr>
       </w:pPr>
       <w:bookmarkStart w:id="80" w:name="_Toc238413452"/>
-      <w:bookmarkStart w:id="81" w:name="_Toc238986042"/>
-      <w:bookmarkStart w:id="82" w:name="_Toc238986092"/>
+      <w:bookmarkStart w:id="81" w:name="_Toc238986092"/>
+      <w:bookmarkStart w:id="82" w:name="_Toc243773214"/>
       <w:r>
         <w:rPr>
           <w:rFonts w:eastAsia="Calibri"/>
@@ -4392,12 +5046,261 @@
     </w:p>
     <w:p>
       <w:pPr>
+        <w:pStyle w:val="Paragraphedeliste"/>
+        <w:numPr>
+          <w:ilvl w:val="0"/>
+          <w:numId w:val="18"/>
+        </w:numPr>
+        <w:spacing w:line="360" w:lineRule="auto"/>
+        <w:jc w:val="both"/>
+        <w:rPr>
+          <w:i/>
+          <w:iCs/>
+          <w:sz w:val="32"/>
+          <w:szCs w:val="32"/>
+        </w:rPr>
+      </w:pPr>
+      <w:r>
+        <w:rPr>
+          <w:rStyle w:val="Accentuation"/>
+          <w:i w:val="0"/>
+          <w:iCs w:val="0"/>
+          <w:sz w:val="24"/>
+          <w:szCs w:val="24"/>
+        </w:rPr>
+        <w:t>Jetons à durée limitée, renouvelables et révocables</w:t>
+      </w:r>
+    </w:p>
+    <w:p>
+      <w:pPr>
+        <w:pStyle w:val="Paragraphedeliste"/>
+        <w:numPr>
+          <w:ilvl w:val="0"/>
+          <w:numId w:val="18"/>
+        </w:numPr>
+        <w:spacing w:line="360" w:lineRule="auto"/>
+        <w:jc w:val="both"/>
+        <w:rPr>
+          <w:i/>
+          <w:iCs/>
+          <w:sz w:val="32"/>
+          <w:szCs w:val="32"/>
+        </w:rPr>
+      </w:pPr>
+      <w:r>
+        <w:rPr>
+          <w:rStyle w:val="Accentuation"/>
+          <w:i w:val="0"/>
+          <w:iCs w:val="0"/>
+          <w:sz w:val="24"/>
+          <w:szCs w:val="24"/>
+        </w:rPr>
+        <w:t>Identifiants non prédictibles (UUID)</w:t>
+      </w:r>
+    </w:p>
+    <w:p>
+      <w:pPr>
+        <w:pStyle w:val="Paragraphedeliste"/>
+        <w:numPr>
+          <w:ilvl w:val="0"/>
+          <w:numId w:val="18"/>
+        </w:numPr>
+        <w:spacing w:line="360" w:lineRule="auto"/>
+        <w:jc w:val="both"/>
+        <w:rPr>
+          <w:i/>
+          <w:iCs/>
+          <w:sz w:val="32"/>
+          <w:szCs w:val="32"/>
+        </w:rPr>
+      </w:pPr>
+      <w:r>
+        <w:rPr>
+          <w:rStyle w:val="Accentuation"/>
+          <w:i w:val="0"/>
+          <w:iCs w:val="0"/>
+          <w:sz w:val="24"/>
+          <w:szCs w:val="24"/>
+        </w:rPr>
+        <w:t>Une ressource n’appartenant pas au client est traitée comme inexistante (404), sans révéler son existence</w:t>
+      </w:r>
+    </w:p>
+    <w:p>
+      <w:pPr>
         <w:spacing w:before="100" w:beforeAutospacing="1" w:after="100" w:afterAutospacing="1" w:line="360" w:lineRule="auto"/>
         <w:jc w:val="both"/>
         <w:rPr>
           <w:sz w:val="24"/>
           <w:szCs w:val="24"/>
         </w:rPr>
+      </w:pPr>
+    </w:p>
+    <w:p>
+      <w:pPr>
+        <w:tabs>
+          <w:tab w:val="left" w:pos="1248"/>
+        </w:tabs>
+      </w:pPr>
+    </w:p>
+    <w:p>
+      <w:pPr>
+        <w:tabs>
+          <w:tab w:val="left" w:pos="1248"/>
+        </w:tabs>
+      </w:pPr>
+    </w:p>
+    <w:p>
+      <w:pPr>
+        <w:tabs>
+          <w:tab w:val="left" w:pos="1248"/>
+        </w:tabs>
+      </w:pPr>
+    </w:p>
+    <w:p>
+      <w:pPr>
+        <w:tabs>
+          <w:tab w:val="left" w:pos="1248"/>
+        </w:tabs>
+      </w:pPr>
+    </w:p>
+    <w:p>
+      <w:pPr>
+        <w:tabs>
+          <w:tab w:val="left" w:pos="1248"/>
+        </w:tabs>
+      </w:pPr>
+    </w:p>
+    <w:p>
+      <w:pPr>
+        <w:tabs>
+          <w:tab w:val="left" w:pos="1248"/>
+        </w:tabs>
+      </w:pPr>
+    </w:p>
+    <w:p>
+      <w:pPr>
+        <w:tabs>
+          <w:tab w:val="left" w:pos="1248"/>
+        </w:tabs>
+      </w:pPr>
+    </w:p>
+    <w:p>
+      <w:pPr>
+        <w:tabs>
+          <w:tab w:val="left" w:pos="1248"/>
+        </w:tabs>
+      </w:pPr>
+    </w:p>
+    <w:p>
+      <w:pPr>
+        <w:tabs>
+          <w:tab w:val="left" w:pos="1248"/>
+        </w:tabs>
+      </w:pPr>
+    </w:p>
+    <w:p>
+      <w:pPr>
+        <w:tabs>
+          <w:tab w:val="left" w:pos="1248"/>
+        </w:tabs>
+      </w:pPr>
+    </w:p>
+    <w:p>
+      <w:pPr>
+        <w:tabs>
+          <w:tab w:val="left" w:pos="1248"/>
+        </w:tabs>
+      </w:pPr>
+    </w:p>
+    <w:p>
+      <w:pPr>
+        <w:tabs>
+          <w:tab w:val="left" w:pos="1248"/>
+        </w:tabs>
+      </w:pPr>
+    </w:p>
+    <w:p>
+      <w:pPr>
+        <w:tabs>
+          <w:tab w:val="left" w:pos="1248"/>
+        </w:tabs>
+      </w:pPr>
+    </w:p>
+    <w:p>
+      <w:pPr>
+        <w:tabs>
+          <w:tab w:val="left" w:pos="1248"/>
+        </w:tabs>
+      </w:pPr>
+    </w:p>
+    <w:p>
+      <w:pPr>
+        <w:tabs>
+          <w:tab w:val="left" w:pos="1248"/>
+        </w:tabs>
+      </w:pPr>
+    </w:p>
+    <w:p>
+      <w:pPr>
+        <w:tabs>
+          <w:tab w:val="left" w:pos="1248"/>
+        </w:tabs>
+      </w:pPr>
+    </w:p>
+    <w:p>
+      <w:pPr>
+        <w:tabs>
+          <w:tab w:val="left" w:pos="1248"/>
+        </w:tabs>
+      </w:pPr>
+    </w:p>
+    <w:p>
+      <w:pPr>
+        <w:tabs>
+          <w:tab w:val="left" w:pos="1248"/>
+        </w:tabs>
+      </w:pPr>
+    </w:p>
+    <w:p>
+      <w:pPr>
+        <w:tabs>
+          <w:tab w:val="left" w:pos="1248"/>
+        </w:tabs>
+      </w:pPr>
+    </w:p>
+    <w:p>
+      <w:pPr>
+        <w:tabs>
+          <w:tab w:val="left" w:pos="1248"/>
+        </w:tabs>
+      </w:pPr>
+    </w:p>
+    <w:p>
+      <w:pPr>
+        <w:tabs>
+          <w:tab w:val="left" w:pos="1248"/>
+        </w:tabs>
+      </w:pPr>
+    </w:p>
+    <w:p>
+      <w:pPr>
+        <w:tabs>
+          <w:tab w:val="left" w:pos="1248"/>
+        </w:tabs>
+      </w:pPr>
+    </w:p>
+    <w:p>
+      <w:pPr>
+        <w:tabs>
+          <w:tab w:val="left" w:pos="1248"/>
+        </w:tabs>
+      </w:pPr>
+    </w:p>
+    <w:p>
+      <w:pPr>
+        <w:tabs>
+          <w:tab w:val="left" w:pos="1248"/>
+        </w:tabs>
       </w:pPr>
     </w:p>
     <w:p>
@@ -4470,8 +5373,8 @@
         </w:rPr>
       </w:pPr>
       <w:bookmarkStart w:id="83" w:name="_Toc238413453"/>
-      <w:bookmarkStart w:id="84" w:name="_Toc238986043"/>
-      <w:bookmarkStart w:id="85" w:name="_Toc238986093"/>
+      <w:bookmarkStart w:id="84" w:name="_Toc238986093"/>
+      <w:bookmarkStart w:id="85" w:name="_Toc243773215"/>
       <w:r>
         <w:rPr>
           <w:rFonts w:eastAsia="Calibri"/>
@@ -4529,7 +5432,7 @@
         </w:rPr>
         <w:fldChar w:fldCharType="separate"/>
       </w:r>
-      <w:hyperlink w:anchor="_Toc238986022" w:history="1">
+      <w:hyperlink w:anchor="_Toc243773194" w:history="1">
         <w:r>
           <w:rPr>
             <w:rStyle w:val="Lienhypertexte"/>
@@ -4567,7 +5470,7 @@
             <w:sz w:val="24"/>
             <w:szCs w:val="24"/>
           </w:rPr>
-          <w:instrText xml:space="preserve"> PAGEREF _Toc238986022 \h </w:instrText>
+          <w:instrText xml:space="preserve"> PAGEREF _Toc243773194 \h </w:instrText>
         </w:r>
         <w:r>
           <w:rPr>
@@ -4620,7 +5523,7 @@
           <w:szCs w:val="24"/>
         </w:rPr>
       </w:pPr>
-      <w:hyperlink w:anchor="_Toc238986023" w:history="1">
+      <w:hyperlink w:anchor="_Toc243773195" w:history="1">
         <w:r>
           <w:rPr>
             <w:rStyle w:val="Lienhypertexte"/>
@@ -4658,7 +5561,7 @@
             <w:sz w:val="24"/>
             <w:szCs w:val="24"/>
           </w:rPr>
-          <w:instrText xml:space="preserve"> PAGEREF _Toc238986023 \h </w:instrText>
+          <w:instrText xml:space="preserve"> PAGEREF _Toc243773195 \h </w:instrText>
         </w:r>
         <w:r>
           <w:rPr>
@@ -4711,7 +5614,7 @@
           <w:szCs w:val="24"/>
         </w:rPr>
       </w:pPr>
-      <w:hyperlink w:anchor="_Toc238986024" w:history="1">
+      <w:hyperlink w:anchor="_Toc243773196" w:history="1">
         <w:r>
           <w:rPr>
             <w:rStyle w:val="Lienhypertexte"/>
@@ -4749,7 +5652,7 @@
             <w:sz w:val="24"/>
             <w:szCs w:val="24"/>
           </w:rPr>
-          <w:instrText xml:space="preserve"> PAGEREF _Toc238986024 \h </w:instrText>
+          <w:instrText xml:space="preserve"> PAGEREF _Toc243773196 \h </w:instrText>
         </w:r>
         <w:r>
           <w:rPr>
@@ -4802,7 +5705,7 @@
           <w:szCs w:val="24"/>
         </w:rPr>
       </w:pPr>
-      <w:hyperlink w:anchor="_Toc238986025" w:history="1">
+      <w:hyperlink w:anchor="_Toc243773197" w:history="1">
         <w:r>
           <w:rPr>
             <w:rStyle w:val="Lienhypertexte"/>
@@ -4840,7 +5743,7 @@
             <w:sz w:val="24"/>
             <w:szCs w:val="24"/>
           </w:rPr>
-          <w:instrText xml:space="preserve"> PAGEREF _Toc238986025 \h </w:instrText>
+          <w:instrText xml:space="preserve"> PAGEREF _Toc243773197 \h </w:instrText>
         </w:r>
         <w:r>
           <w:rPr>
@@ -4893,7 +5796,7 @@
           <w:szCs w:val="24"/>
         </w:rPr>
       </w:pPr>
-      <w:hyperlink w:anchor="_Toc238986026" w:history="1">
+      <w:hyperlink w:anchor="_Toc243773198" w:history="1">
         <w:r>
           <w:rPr>
             <w:rStyle w:val="Lienhypertexte"/>
@@ -4931,7 +5834,7 @@
             <w:sz w:val="24"/>
             <w:szCs w:val="24"/>
           </w:rPr>
-          <w:instrText xml:space="preserve"> PAGEREF _Toc238986026 \h </w:instrText>
+          <w:instrText xml:space="preserve"> PAGEREF _Toc243773198 \h </w:instrText>
         </w:r>
         <w:r>
           <w:rPr>
@@ -4984,7 +5887,7 @@
           <w:szCs w:val="24"/>
         </w:rPr>
       </w:pPr>
-      <w:hyperlink w:anchor="_Toc238986027" w:history="1">
+      <w:hyperlink w:anchor="_Toc243773199" w:history="1">
         <w:r>
           <w:rPr>
             <w:rStyle w:val="Lienhypertexte"/>
@@ -5022,7 +5925,7 @@
             <w:sz w:val="24"/>
             <w:szCs w:val="24"/>
           </w:rPr>
-          <w:instrText xml:space="preserve"> PAGEREF _Toc238986027 \h </w:instrText>
+          <w:instrText xml:space="preserve"> PAGEREF _Toc243773199 \h </w:instrText>
         </w:r>
         <w:r>
           <w:rPr>
@@ -5075,7 +5978,7 @@
           <w:szCs w:val="24"/>
         </w:rPr>
       </w:pPr>
-      <w:hyperlink w:anchor="_Toc238986028" w:history="1">
+      <w:hyperlink w:anchor="_Toc243773200" w:history="1">
         <w:r>
           <w:rPr>
             <w:rStyle w:val="Lienhypertexte"/>
@@ -5113,7 +6016,7 @@
             <w:sz w:val="24"/>
             <w:szCs w:val="24"/>
           </w:rPr>
-          <w:instrText xml:space="preserve"> PAGEREF _Toc238986028 \h </w:instrText>
+          <w:instrText xml:space="preserve"> PAGEREF _Toc243773200 \h </w:instrText>
         </w:r>
         <w:r>
           <w:rPr>
@@ -5166,7 +6069,7 @@
           <w:szCs w:val="24"/>
         </w:rPr>
       </w:pPr>
-      <w:hyperlink w:anchor="_Toc238986029" w:history="1">
+      <w:hyperlink w:anchor="_Toc243773201" w:history="1">
         <w:r>
           <w:rPr>
             <w:rStyle w:val="Lienhypertexte"/>
@@ -5204,7 +6107,7 @@
             <w:sz w:val="24"/>
             <w:szCs w:val="24"/>
           </w:rPr>
-          <w:instrText xml:space="preserve"> PAGEREF _Toc238986029 \h </w:instrText>
+          <w:instrText xml:space="preserve"> PAGEREF _Toc243773201 \h </w:instrText>
         </w:r>
         <w:r>
           <w:rPr>
@@ -5257,7 +6160,7 @@
           <w:szCs w:val="24"/>
         </w:rPr>
       </w:pPr>
-      <w:hyperlink w:anchor="_Toc238986030" w:history="1">
+      <w:hyperlink w:anchor="_Toc243773202" w:history="1">
         <w:r>
           <w:rPr>
             <w:rStyle w:val="Lienhypertexte"/>
@@ -5295,7 +6198,7 @@
             <w:sz w:val="24"/>
             <w:szCs w:val="24"/>
           </w:rPr>
-          <w:instrText xml:space="preserve"> PAGEREF _Toc238986030 \h </w:instrText>
+          <w:instrText xml:space="preserve"> PAGEREF _Toc243773202 \h </w:instrText>
         </w:r>
         <w:r>
           <w:rPr>
@@ -5348,7 +6251,7 @@
           <w:szCs w:val="24"/>
         </w:rPr>
       </w:pPr>
-      <w:hyperlink w:anchor="_Toc238986031" w:history="1">
+      <w:hyperlink w:anchor="_Toc243773203" w:history="1">
         <w:r>
           <w:rPr>
             <w:rStyle w:val="Lienhypertexte"/>
@@ -5386,7 +6289,7 @@
             <w:sz w:val="24"/>
             <w:szCs w:val="24"/>
           </w:rPr>
-          <w:instrText xml:space="preserve"> PAGEREF _Toc238986031 \h </w:instrText>
+          <w:instrText xml:space="preserve"> PAGEREF _Toc243773203 \h </w:instrText>
         </w:r>
         <w:r>
           <w:rPr>
@@ -5439,7 +6342,7 @@
           <w:szCs w:val="24"/>
         </w:rPr>
       </w:pPr>
-      <w:hyperlink w:anchor="_Toc238986032" w:history="1">
+      <w:hyperlink w:anchor="_Toc243773204" w:history="1">
         <w:r>
           <w:rPr>
             <w:rStyle w:val="Lienhypertexte"/>
@@ -5476,7 +6379,7 @@
             <w:sz w:val="24"/>
             <w:szCs w:val="24"/>
           </w:rPr>
-          <w:instrText xml:space="preserve"> PAGEREF _Toc238986032 \h </w:instrText>
+          <w:instrText xml:space="preserve"> PAGEREF _Toc243773204 \h </w:instrText>
         </w:r>
         <w:r>
           <w:rPr>
@@ -5529,7 +6432,7 @@
           <w:szCs w:val="24"/>
         </w:rPr>
       </w:pPr>
-      <w:hyperlink w:anchor="_Toc238986033" w:history="1">
+      <w:hyperlink w:anchor="_Toc243773205" w:history="1">
         <w:r>
           <w:rPr>
             <w:rStyle w:val="Lienhypertexte"/>
@@ -5567,7 +6470,7 @@
             <w:sz w:val="24"/>
             <w:szCs w:val="24"/>
           </w:rPr>
-          <w:instrText xml:space="preserve"> PAGEREF _Toc238986033 \h </w:instrText>
+          <w:instrText xml:space="preserve"> PAGEREF _Toc243773205 \h </w:instrText>
         </w:r>
         <w:r>
           <w:rPr>
@@ -5620,7 +6523,7 @@
           <w:szCs w:val="24"/>
         </w:rPr>
       </w:pPr>
-      <w:hyperlink w:anchor="_Toc238986034" w:history="1">
+      <w:hyperlink w:anchor="_Toc243773206" w:history="1">
         <w:r>
           <w:rPr>
             <w:rStyle w:val="Lienhypertexte"/>
@@ -5658,7 +6561,7 @@
             <w:sz w:val="24"/>
             <w:szCs w:val="24"/>
           </w:rPr>
-          <w:instrText xml:space="preserve"> PAGEREF _Toc238986034 \h </w:instrText>
+          <w:instrText xml:space="preserve"> PAGEREF _Toc243773206 \h </w:instrText>
         </w:r>
         <w:r>
           <w:rPr>
@@ -5711,7 +6614,7 @@
           <w:szCs w:val="24"/>
         </w:rPr>
       </w:pPr>
-      <w:hyperlink w:anchor="_Toc238986035" w:history="1">
+      <w:hyperlink w:anchor="_Toc243773207" w:history="1">
         <w:r>
           <w:rPr>
             <w:rStyle w:val="Lienhypertexte"/>
@@ -5748,7 +6651,7 @@
             <w:sz w:val="24"/>
             <w:szCs w:val="24"/>
           </w:rPr>
-          <w:instrText xml:space="preserve"> PAGEREF _Toc238986035 \h </w:instrText>
+          <w:instrText xml:space="preserve"> PAGEREF _Toc243773207 \h </w:instrText>
         </w:r>
         <w:r>
           <w:rPr>
@@ -5801,7 +6704,7 @@
           <w:szCs w:val="24"/>
         </w:rPr>
       </w:pPr>
-      <w:hyperlink w:anchor="_Toc238986036" w:history="1">
+      <w:hyperlink w:anchor="_Toc243773208" w:history="1">
         <w:r>
           <w:rPr>
             <w:rStyle w:val="Lienhypertexte"/>
@@ -5839,7 +6742,7 @@
             <w:sz w:val="24"/>
             <w:szCs w:val="24"/>
           </w:rPr>
-          <w:instrText xml:space="preserve"> PAGEREF _Toc238986036 \h </w:instrText>
+          <w:instrText xml:space="preserve"> PAGEREF _Toc243773208 \h </w:instrText>
         </w:r>
         <w:r>
           <w:rPr>
@@ -5892,7 +6795,7 @@
           <w:szCs w:val="24"/>
         </w:rPr>
       </w:pPr>
-      <w:hyperlink w:anchor="_Toc238986037" w:history="1">
+      <w:hyperlink w:anchor="_Toc243773209" w:history="1">
         <w:r>
           <w:rPr>
             <w:rStyle w:val="Lienhypertexte"/>
@@ -5930,7 +6833,7 @@
             <w:sz w:val="24"/>
             <w:szCs w:val="24"/>
           </w:rPr>
-          <w:instrText xml:space="preserve"> PAGEREF _Toc238986037 \h </w:instrText>
+          <w:instrText xml:space="preserve"> PAGEREF _Toc243773209 \h </w:instrText>
         </w:r>
         <w:r>
           <w:rPr>
@@ -5956,7 +6859,7 @@
             <w:sz w:val="24"/>
             <w:szCs w:val="24"/>
           </w:rPr>
-          <w:t>6</w:t>
+          <w:t>7</w:t>
         </w:r>
         <w:r>
           <w:rPr>
@@ -5983,7 +6886,7 @@
           <w:szCs w:val="24"/>
         </w:rPr>
       </w:pPr>
-      <w:hyperlink w:anchor="_Toc238986038" w:history="1">
+      <w:hyperlink w:anchor="_Toc243773210" w:history="1">
         <w:r>
           <w:rPr>
             <w:rStyle w:val="Lienhypertexte"/>
@@ -6021,7 +6924,7 @@
             <w:sz w:val="24"/>
             <w:szCs w:val="24"/>
           </w:rPr>
-          <w:instrText xml:space="preserve"> PAGEREF _Toc238986038 \h </w:instrText>
+          <w:instrText xml:space="preserve"> PAGEREF _Toc243773210 \h </w:instrText>
         </w:r>
         <w:r>
           <w:rPr>
@@ -6047,7 +6950,7 @@
             <w:sz w:val="24"/>
             <w:szCs w:val="24"/>
           </w:rPr>
-          <w:t>6</w:t>
+          <w:t>7</w:t>
         </w:r>
         <w:r>
           <w:rPr>
@@ -6074,7 +6977,7 @@
           <w:szCs w:val="24"/>
         </w:rPr>
       </w:pPr>
-      <w:hyperlink w:anchor="_Toc238986039" w:history="1">
+      <w:hyperlink w:anchor="_Toc243773211" w:history="1">
         <w:r>
           <w:rPr>
             <w:rStyle w:val="Lienhypertexte"/>
@@ -6112,7 +7015,7 @@
             <w:sz w:val="24"/>
             <w:szCs w:val="24"/>
           </w:rPr>
-          <w:instrText xml:space="preserve"> PAGEREF _Toc238986039 \h </w:instrText>
+          <w:instrText xml:space="preserve"> PAGEREF _Toc243773211 \h </w:instrText>
         </w:r>
         <w:r>
           <w:rPr>
@@ -6138,7 +7041,7 @@
             <w:sz w:val="24"/>
             <w:szCs w:val="24"/>
           </w:rPr>
-          <w:t>6</w:t>
+          <w:t>7</w:t>
         </w:r>
         <w:r>
           <w:rPr>
@@ -6165,7 +7068,7 @@
           <w:szCs w:val="24"/>
         </w:rPr>
       </w:pPr>
-      <w:hyperlink w:anchor="_Toc238986040" w:history="1">
+      <w:hyperlink w:anchor="_Toc243773212" w:history="1">
         <w:r>
           <w:rPr>
             <w:rStyle w:val="Lienhypertexte"/>
@@ -6203,7 +7106,7 @@
             <w:sz w:val="24"/>
             <w:szCs w:val="24"/>
           </w:rPr>
-          <w:instrText xml:space="preserve"> PAGEREF _Toc238986040 \h </w:instrText>
+          <w:instrText xml:space="preserve"> PAGEREF _Toc243773212 \h </w:instrText>
         </w:r>
         <w:r>
           <w:rPr>
@@ -6256,7 +7159,7 @@
           <w:szCs w:val="24"/>
         </w:rPr>
       </w:pPr>
-      <w:hyperlink w:anchor="_Toc238986041" w:history="1">
+      <w:hyperlink w:anchor="_Toc243773213" w:history="1">
         <w:r>
           <w:rPr>
             <w:rStyle w:val="Lienhypertexte"/>
@@ -6294,7 +7197,7 @@
             <w:sz w:val="24"/>
             <w:szCs w:val="24"/>
           </w:rPr>
-          <w:instrText xml:space="preserve"> PAGEREF _Toc238986041 \h </w:instrText>
+          <w:instrText xml:space="preserve"> PAGEREF _Toc243773213 \h </w:instrText>
         </w:r>
         <w:r>
           <w:rPr>
@@ -6347,7 +7250,7 @@
           <w:szCs w:val="24"/>
         </w:rPr>
       </w:pPr>
-      <w:hyperlink w:anchor="_Toc238986042" w:history="1">
+      <w:hyperlink w:anchor="_Toc243773214" w:history="1">
         <w:r>
           <w:rPr>
             <w:rStyle w:val="Lienhypertexte"/>
@@ -6385,7 +7288,7 @@
             <w:sz w:val="24"/>
             <w:szCs w:val="24"/>
           </w:rPr>
-          <w:instrText xml:space="preserve"> PAGEREF _Toc238986042 \h </w:instrText>
+          <w:instrText xml:space="preserve"> PAGEREF _Toc243773214 \h </w:instrText>
         </w:r>
         <w:r>
           <w:rPr>
@@ -6411,7 +7314,7 @@
             <w:sz w:val="24"/>
             <w:szCs w:val="24"/>
           </w:rPr>
-          <w:t>7</w:t>
+          <w:t>8</w:t>
         </w:r>
         <w:r>
           <w:rPr>
@@ -6438,7 +7341,7 @@
           <w:szCs w:val="24"/>
         </w:rPr>
       </w:pPr>
-      <w:hyperlink w:anchor="_Toc238986043" w:history="1">
+      <w:hyperlink w:anchor="_Toc243773215" w:history="1">
         <w:r>
           <w:rPr>
             <w:rStyle w:val="Lienhypertexte"/>
@@ -6476,7 +7379,7 @@
             <w:sz w:val="24"/>
             <w:szCs w:val="24"/>
           </w:rPr>
-          <w:instrText xml:space="preserve"> PAGEREF _Toc238986043 \h </w:instrText>
+          <w:instrText xml:space="preserve"> PAGEREF _Toc243773215 \h </w:instrText>
         </w:r>
         <w:r>
           <w:rPr>
@@ -6502,7 +7405,7 @@
             <w:sz w:val="24"/>
             <w:szCs w:val="24"/>
           </w:rPr>
-          <w:t>8</w:t>
+          <w:t>9</w:t>
         </w:r>
         <w:r>
           <w:rPr>
@@ -9234,6 +10137,7 @@
   <w:style w:type="paragraph" w:default="1" w:styleId="Normal">
     <w:name w:val="Normal"/>
     <w:qFormat/>
+    <w:rsid w:val="009B3208"/>
   </w:style>
   <w:style w:type="paragraph" w:styleId="Titre1">
     <w:name w:val="heading 1"/>
@@ -9588,6 +10492,17 @@
       </w:tblBorders>
     </w:tblPr>
   </w:style>
+  <w:style w:type="character" w:styleId="Accentuation">
+    <w:name w:val="Emphasis"/>
+    <w:basedOn w:val="Policepardfaut"/>
+    <w:uiPriority w:val="20"/>
+    <w:qFormat/>
+    <w:rsid w:val="00894199"/>
+    <w:rPr>
+      <w:i/>
+      <w:iCs/>
+    </w:rPr>
+  </w:style>
 </w:styles>
 </file>
 

</xml_diff>